<commit_message>
Update scholarship forms from final version 8 package
</commit_message>
<xml_diff>
--- a/documents/Benchwarmers Application.docx
+++ b/documents/Benchwarmers Application.docx
@@ -821,16 +821,951 @@
     <w:p>
       <w:pPr>
         <w:rPr>
-          <w:bCs/>
-          <w:sz w:val="22"/>
-          <w:szCs w:val="22"/>
-        </w:rPr>
-      </w:pPr>
-    </w:p>
-    <w:p>
-      <w:pPr>
-        <w:ind w:left="7200" w:firstLine="720"/>
+          <w:sz w:val="36"/>
+          <w:szCs w:val="36"/>
+          <w:u w:val="single"/>
+        </w:rPr>
+      </w:pPr>
+      <w:r>
+        <w:rPr>
+          <w:sz w:val="32"/>
+          <w:szCs w:val="32"/>
+          <w:u w:val="single"/>
+        </w:rPr>
+        <w:br w:type="page"/>
+      </w:r>
+      <w:r>
+        <w:rPr>
+          <w:sz w:val="32"/>
+          <w:szCs w:val="32"/>
+          <w:u w:val="single"/>
+        </w:rPr>
+        <w:lastRenderedPageBreak/>
+        <w:t xml:space="preserve">BENCHWARMERS </w:t>
+      </w:r>
+      <w:r>
+        <w:rPr>
+          <w:sz w:val="36"/>
+          <w:szCs w:val="36"/>
+          <w:u w:val="single"/>
+        </w:rPr>
+        <w:t>Committees</w:t>
+      </w:r>
+    </w:p>
+    <w:p>
+      <w:pPr>
         <w:jc w:val="center"/>
+        <w:rPr>
+          <w:sz w:val="32"/>
+          <w:szCs w:val="32"/>
+          <w:u w:val="single"/>
+        </w:rPr>
+      </w:pPr>
+    </w:p>
+    <w:p>
+      <w:pPr>
+        <w:rPr>
+          <w:rFonts w:eastAsiaTheme="minorEastAsia"/>
+          <w:u w:val="single"/>
+          <w:shd w:val="clear" w:color="auto" w:fill="FFFFFF"/>
+          <w:lang w:bidi="he-IL"/>
+        </w:rPr>
+      </w:pPr>
+    </w:p>
+    <w:p>
+      <w:pPr>
+        <w:rPr>
+          <w:rFonts w:eastAsiaTheme="minorEastAsia"/>
+          <w:shd w:val="clear" w:color="auto" w:fill="FFFFFF"/>
+          <w:lang w:bidi="he-IL"/>
+        </w:rPr>
+      </w:pPr>
+      <w:r>
+        <w:rPr>
+          <w:rFonts w:eastAsiaTheme="minorEastAsia"/>
+          <w:u w:val="single"/>
+          <w:shd w:val="clear" w:color="auto" w:fill="FFFFFF"/>
+          <w:lang w:bidi="he-IL"/>
+        </w:rPr>
+        <w:t xml:space="preserve">Alumni Game Committee- </w:t>
+      </w:r>
+      <w:r>
+        <w:rPr>
+          <w:rFonts w:eastAsiaTheme="minorEastAsia"/>
+          <w:shd w:val="clear" w:color="auto" w:fill="FFFFFF"/>
+          <w:lang w:bidi="he-IL"/>
+        </w:rPr>
+        <w:t>Schedule and help coordinate Alumn</w:t>
+      </w:r>
+      <w:r>
+        <w:rPr>
+          <w:rFonts w:eastAsiaTheme="minorEastAsia"/>
+          <w:shd w:val="clear" w:color="auto" w:fill="FFFFFF"/>
+          <w:lang w:bidi="he-IL"/>
+        </w:rPr>
+        <w:t>i bask</w:t>
+      </w:r>
+      <w:r>
+        <w:rPr>
+          <w:rFonts w:eastAsiaTheme="minorEastAsia"/>
+          <w:shd w:val="clear" w:color="auto" w:fill="FFFFFF"/>
+          <w:lang w:bidi="he-IL"/>
+        </w:rPr>
+        <w:t xml:space="preserve">etball game- typically in late </w:t>
+      </w:r>
+      <w:r>
+        <w:rPr>
+          <w:rFonts w:eastAsiaTheme="minorEastAsia"/>
+          <w:shd w:val="clear" w:color="auto" w:fill="FFFFFF"/>
+          <w:lang w:bidi="he-IL"/>
+        </w:rPr>
+        <w:t>autumn</w:t>
+      </w:r>
+      <w:r>
+        <w:rPr>
+          <w:rFonts w:eastAsiaTheme="minorEastAsia"/>
+          <w:shd w:val="clear" w:color="auto" w:fill="FFFFFF"/>
+          <w:lang w:bidi="he-IL"/>
+        </w:rPr>
+        <w:t>.</w:t>
+      </w:r>
+    </w:p>
+    <w:p>
+      <w:pPr>
+        <w:rPr>
+          <w:rFonts w:eastAsiaTheme="minorEastAsia"/>
+          <w:u w:val="single"/>
+          <w:shd w:val="clear" w:color="auto" w:fill="FFFFFF"/>
+          <w:lang w:bidi="he-IL"/>
+        </w:rPr>
+      </w:pPr>
+    </w:p>
+    <w:p>
+      <w:pPr>
+        <w:rPr>
+          <w:sz w:val="22"/>
+          <w:szCs w:val="22"/>
+        </w:rPr>
+      </w:pPr>
+      <w:r>
+        <w:rPr>
+          <w:rFonts w:eastAsiaTheme="minorEastAsia"/>
+          <w:u w:val="single"/>
+          <w:shd w:val="clear" w:color="auto" w:fill="FFFFFF"/>
+          <w:lang w:bidi="he-IL"/>
+        </w:rPr>
+        <w:t xml:space="preserve">Basketball Program Committee </w:t>
+      </w:r>
+      <w:r>
+        <w:rPr>
+          <w:rFonts w:eastAsiaTheme="minorEastAsia"/>
+          <w:u w:val="single"/>
+          <w:shd w:val="clear" w:color="auto" w:fill="FFFFFF"/>
+          <w:lang w:bidi="he-IL"/>
+        </w:rPr>
+        <w:t xml:space="preserve">- </w:t>
+      </w:r>
+      <w:r>
+        <w:rPr>
+          <w:sz w:val="22"/>
+          <w:szCs w:val="22"/>
+        </w:rPr>
+        <w:t>Generate an annual printed program for the Basketball teams to be distributed at home games.  Sell advertising space within the program to pay/offset the cost of producing the program.</w:t>
+      </w:r>
+    </w:p>
+    <w:p>
+      <w:pPr>
+        <w:rPr>
+          <w:rFonts w:eastAsiaTheme="minorEastAsia"/>
+          <w:sz w:val="22"/>
+          <w:szCs w:val="22"/>
+          <w:shd w:val="clear" w:color="auto" w:fill="FFFFFF"/>
+          <w:lang w:bidi="he-IL"/>
+        </w:rPr>
+      </w:pPr>
+    </w:p>
+    <w:p>
+      <w:pPr>
+        <w:rPr>
+          <w:sz w:val="22"/>
+          <w:szCs w:val="22"/>
+        </w:rPr>
+      </w:pPr>
+      <w:r>
+        <w:rPr>
+          <w:rFonts w:eastAsiaTheme="minorEastAsia"/>
+          <w:u w:val="single"/>
+          <w:shd w:val="clear" w:color="auto" w:fill="FFFFFF"/>
+          <w:lang w:bidi="he-IL"/>
+        </w:rPr>
+        <w:t xml:space="preserve">Awards Committee </w:t>
+      </w:r>
+      <w:r>
+        <w:rPr>
+          <w:rFonts w:eastAsiaTheme="minorEastAsia"/>
+          <w:sz w:val="22"/>
+          <w:szCs w:val="22"/>
+          <w:shd w:val="clear" w:color="auto" w:fill="FFFFFF"/>
+          <w:lang w:bidi="he-IL"/>
+        </w:rPr>
+        <w:t>–</w:t>
+      </w:r>
+      <w:r>
+        <w:rPr>
+          <w:rFonts w:eastAsiaTheme="minorEastAsia"/>
+          <w:sz w:val="22"/>
+          <w:szCs w:val="22"/>
+          <w:shd w:val="clear" w:color="auto" w:fill="FFFFFF"/>
+          <w:lang w:bidi="he-IL"/>
+        </w:rPr>
+        <w:t xml:space="preserve"> </w:t>
+      </w:r>
+      <w:r>
+        <w:rPr>
+          <w:rFonts w:eastAsiaTheme="minorEastAsia"/>
+          <w:sz w:val="22"/>
+          <w:szCs w:val="22"/>
+          <w:shd w:val="clear" w:color="auto" w:fill="FFFFFF"/>
+          <w:lang w:bidi="he-IL"/>
+        </w:rPr>
+        <w:t>Support the</w:t>
+      </w:r>
+      <w:r>
+        <w:rPr>
+          <w:rFonts w:eastAsiaTheme="minorEastAsia"/>
+          <w:u w:val="single"/>
+          <w:shd w:val="clear" w:color="auto" w:fill="FFFFFF"/>
+          <w:lang w:bidi="he-IL"/>
+        </w:rPr>
+        <w:t xml:space="preserve"> </w:t>
+      </w:r>
+      <w:r>
+        <w:rPr>
+          <w:sz w:val="22"/>
+          <w:szCs w:val="22"/>
+        </w:rPr>
+        <w:t xml:space="preserve">Awards </w:t>
+      </w:r>
+      <w:r>
+        <w:rPr>
+          <w:sz w:val="22"/>
+          <w:szCs w:val="22"/>
+        </w:rPr>
+        <w:t>Ceremony</w:t>
+      </w:r>
+      <w:r>
+        <w:rPr>
+          <w:sz w:val="22"/>
+          <w:szCs w:val="22"/>
+        </w:rPr>
+        <w:t xml:space="preserve"> for all interscholastic sports teams, including, opportunities for individual and team recognitions.  Provide awards such as congratulatory items, team banquets/outings, ot</w:t>
+      </w:r>
+      <w:r>
+        <w:rPr>
+          <w:sz w:val="22"/>
+          <w:szCs w:val="22"/>
+        </w:rPr>
+        <w:t>her recognitions</w:t>
+      </w:r>
+      <w:r>
+        <w:rPr>
+          <w:sz w:val="22"/>
+          <w:szCs w:val="22"/>
+        </w:rPr>
+        <w:t xml:space="preserve"> for Championship teams (Shoreline League or State Championship) as specified in previously established procedures/guidelines.</w:t>
+      </w:r>
+    </w:p>
+    <w:p>
+      <w:pPr>
+        <w:rPr>
+          <w:rFonts w:eastAsiaTheme="minorEastAsia"/>
+          <w:sz w:val="22"/>
+          <w:szCs w:val="22"/>
+          <w:shd w:val="clear" w:color="auto" w:fill="FFFFFF"/>
+          <w:lang w:bidi="he-IL"/>
+        </w:rPr>
+      </w:pPr>
+    </w:p>
+    <w:p>
+      <w:pPr>
+        <w:rPr>
+          <w:sz w:val="22"/>
+          <w:szCs w:val="22"/>
+        </w:rPr>
+      </w:pPr>
+      <w:r>
+        <w:rPr>
+          <w:rFonts w:eastAsiaTheme="minorEastAsia"/>
+          <w:u w:val="single"/>
+          <w:shd w:val="clear" w:color="auto" w:fill="FFFFFF"/>
+          <w:lang w:bidi="he-IL"/>
+        </w:rPr>
+        <w:t xml:space="preserve">By-Laws Committee </w:t>
+      </w:r>
+      <w:r>
+        <w:rPr>
+          <w:rFonts w:eastAsiaTheme="minorEastAsia"/>
+          <w:u w:val="single"/>
+          <w:shd w:val="clear" w:color="auto" w:fill="FFFFFF"/>
+          <w:lang w:bidi="he-IL"/>
+        </w:rPr>
+        <w:t xml:space="preserve">- </w:t>
+      </w:r>
+      <w:r>
+        <w:rPr>
+          <w:sz w:val="22"/>
+          <w:szCs w:val="22"/>
+        </w:rPr>
+        <w:t>Maintain Bylaws document and update changes.  Report status annually.</w:t>
+      </w:r>
+    </w:p>
+    <w:p>
+      <w:pPr>
+        <w:rPr>
+          <w:rFonts w:eastAsiaTheme="minorEastAsia"/>
+          <w:u w:val="single"/>
+          <w:shd w:val="clear" w:color="auto" w:fill="FFFFFF"/>
+          <w:lang w:bidi="he-IL"/>
+        </w:rPr>
+      </w:pPr>
+    </w:p>
+    <w:p>
+      <w:pPr>
+        <w:rPr>
+          <w:rFonts w:eastAsiaTheme="minorEastAsia"/>
+          <w:sz w:val="22"/>
+          <w:szCs w:val="22"/>
+          <w:shd w:val="clear" w:color="auto" w:fill="FFFFFF"/>
+          <w:lang w:bidi="he-IL"/>
+        </w:rPr>
+      </w:pPr>
+      <w:r>
+        <w:rPr>
+          <w:rFonts w:eastAsiaTheme="minorEastAsia"/>
+          <w:u w:val="single"/>
+          <w:shd w:val="clear" w:color="auto" w:fill="FFFFFF"/>
+          <w:lang w:bidi="he-IL"/>
+        </w:rPr>
+        <w:t xml:space="preserve">Concessions Committee </w:t>
+      </w:r>
+      <w:r>
+        <w:rPr>
+          <w:rFonts w:eastAsiaTheme="minorEastAsia"/>
+          <w:u w:val="single"/>
+          <w:shd w:val="clear" w:color="auto" w:fill="FFFFFF"/>
+          <w:lang w:bidi="he-IL"/>
+        </w:rPr>
+        <w:t xml:space="preserve">- </w:t>
+      </w:r>
+      <w:r>
+        <w:rPr>
+          <w:sz w:val="22"/>
+          <w:szCs w:val="22"/>
+        </w:rPr>
+        <w:t xml:space="preserve">Sell food, drink, or souvenir items at CIAC contests </w:t>
+      </w:r>
+      <w:r>
+        <w:rPr>
+          <w:sz w:val="22"/>
+          <w:szCs w:val="22"/>
+        </w:rPr>
+        <w:t>on CRHS premises</w:t>
+      </w:r>
+      <w:r>
+        <w:rPr>
+          <w:sz w:val="22"/>
+          <w:szCs w:val="22"/>
+        </w:rPr>
+        <w:t xml:space="preserve"> </w:t>
+      </w:r>
+      <w:r>
+        <w:rPr>
+          <w:sz w:val="22"/>
+          <w:szCs w:val="22"/>
+        </w:rPr>
+        <w:t>for</w:t>
+      </w:r>
+      <w:r>
+        <w:rPr>
+          <w:sz w:val="22"/>
+          <w:szCs w:val="22"/>
+        </w:rPr>
+        <w:t xml:space="preserve"> boys</w:t>
+      </w:r>
+      <w:r>
+        <w:rPr>
+          <w:sz w:val="22"/>
+          <w:szCs w:val="22"/>
+        </w:rPr>
+        <w:t xml:space="preserve"> &amp; girls</w:t>
+      </w:r>
+      <w:r>
+        <w:rPr>
+          <w:sz w:val="22"/>
+          <w:szCs w:val="22"/>
+        </w:rPr>
+        <w:t xml:space="preserve"> and home basketball games</w:t>
+      </w:r>
+      <w:r>
+        <w:rPr>
+          <w:sz w:val="22"/>
+          <w:szCs w:val="22"/>
+        </w:rPr>
+        <w:t>,</w:t>
+      </w:r>
+      <w:r>
+        <w:rPr>
+          <w:sz w:val="22"/>
+          <w:szCs w:val="22"/>
+        </w:rPr>
+        <w:t xml:space="preserve"> including</w:t>
+      </w:r>
+      <w:r>
+        <w:rPr>
+          <w:sz w:val="22"/>
+          <w:szCs w:val="22"/>
+        </w:rPr>
+        <w:t xml:space="preserve"> </w:t>
+      </w:r>
+      <w:r>
+        <w:rPr>
+          <w:sz w:val="22"/>
+          <w:szCs w:val="22"/>
+        </w:rPr>
+        <w:t>food and supply ordering,</w:t>
+      </w:r>
+    </w:p>
+    <w:p>
+      <w:pPr>
+        <w:rPr>
+          <w:rFonts w:eastAsiaTheme="minorEastAsia"/>
+          <w:u w:val="single"/>
+          <w:shd w:val="clear" w:color="auto" w:fill="FFFFFF"/>
+          <w:lang w:bidi="he-IL"/>
+        </w:rPr>
+      </w:pPr>
+    </w:p>
+    <w:p>
+      <w:pPr>
+        <w:rPr>
+          <w:sz w:val="22"/>
+          <w:szCs w:val="22"/>
+        </w:rPr>
+      </w:pPr>
+      <w:r>
+        <w:rPr>
+          <w:rFonts w:eastAsiaTheme="minorEastAsia"/>
+          <w:u w:val="single"/>
+          <w:shd w:val="clear" w:color="auto" w:fill="FFFFFF"/>
+          <w:lang w:bidi="he-IL"/>
+        </w:rPr>
+        <w:t xml:space="preserve">Durham Fair Committee </w:t>
+      </w:r>
+      <w:r>
+        <w:rPr>
+          <w:rFonts w:eastAsiaTheme="minorEastAsia"/>
+          <w:u w:val="single"/>
+          <w:shd w:val="clear" w:color="auto" w:fill="FFFFFF"/>
+          <w:lang w:bidi="he-IL"/>
+        </w:rPr>
+        <w:t xml:space="preserve">- </w:t>
+      </w:r>
+      <w:r>
+        <w:rPr>
+          <w:sz w:val="22"/>
+          <w:szCs w:val="22"/>
+        </w:rPr>
+        <w:t>Sell food, drink, or souvenir items at the Durham Fair.  Coordinate booth and equipment maintenance and readiness, food and supply ordering, and member/volunteer participation.</w:t>
+      </w:r>
+    </w:p>
+    <w:p>
+      <w:pPr>
+        <w:rPr>
+          <w:rFonts w:eastAsiaTheme="minorEastAsia"/>
+          <w:sz w:val="22"/>
+          <w:szCs w:val="22"/>
+          <w:shd w:val="clear" w:color="auto" w:fill="FFFFFF"/>
+          <w:lang w:bidi="he-IL"/>
+        </w:rPr>
+      </w:pPr>
+    </w:p>
+    <w:p>
+      <w:pPr>
+        <w:rPr>
+          <w:sz w:val="22"/>
+          <w:szCs w:val="22"/>
+        </w:rPr>
+      </w:pPr>
+      <w:r>
+        <w:rPr>
+          <w:rFonts w:eastAsiaTheme="minorEastAsia"/>
+          <w:u w:val="single"/>
+          <w:shd w:val="clear" w:color="auto" w:fill="FFFFFF"/>
+          <w:lang w:bidi="he-IL"/>
+        </w:rPr>
+        <w:t>Entertainment</w:t>
+      </w:r>
+      <w:r>
+        <w:rPr>
+          <w:rFonts w:eastAsiaTheme="minorEastAsia"/>
+          <w:u w:val="single"/>
+          <w:shd w:val="clear" w:color="auto" w:fill="FFFFFF"/>
+          <w:lang w:bidi="he-IL"/>
+        </w:rPr>
+        <w:t xml:space="preserve">- </w:t>
+      </w:r>
+      <w:r>
+        <w:rPr>
+          <w:sz w:val="22"/>
+          <w:szCs w:val="22"/>
+        </w:rPr>
+        <w:t>Suggest and coordinate activities to boost member morale and club cohesiveness.</w:t>
+      </w:r>
+    </w:p>
+    <w:p>
+      <w:pPr>
+        <w:rPr>
+          <w:sz w:val="22"/>
+          <w:szCs w:val="22"/>
+        </w:rPr>
+      </w:pPr>
+    </w:p>
+    <w:p>
+      <w:pPr>
+        <w:rPr>
+          <w:sz w:val="22"/>
+          <w:szCs w:val="22"/>
+        </w:rPr>
+      </w:pPr>
+      <w:r>
+        <w:rPr>
+          <w:u w:val="single"/>
+        </w:rPr>
+        <w:t>Fair Building Committee</w:t>
+      </w:r>
+      <w:r>
+        <w:rPr>
+          <w:sz w:val="22"/>
+          <w:szCs w:val="22"/>
+        </w:rPr>
+        <w:t xml:space="preserve"> - Maintenance, repairs, remodel, etc., to the Fair booth, as necessary, to maintain an efficient, neat, clean operation.</w:t>
+      </w:r>
+    </w:p>
+    <w:p>
+      <w:pPr>
+        <w:rPr>
+          <w:rFonts w:eastAsiaTheme="minorEastAsia"/>
+          <w:u w:val="single"/>
+          <w:shd w:val="clear" w:color="auto" w:fill="FFFFFF"/>
+          <w:lang w:bidi="he-IL"/>
+        </w:rPr>
+      </w:pPr>
+    </w:p>
+    <w:p>
+      <w:pPr>
+        <w:rPr>
+          <w:sz w:val="22"/>
+          <w:szCs w:val="22"/>
+        </w:rPr>
+      </w:pPr>
+      <w:r>
+        <w:rPr>
+          <w:rFonts w:eastAsiaTheme="minorEastAsia"/>
+          <w:u w:val="single"/>
+          <w:shd w:val="clear" w:color="auto" w:fill="FFFFFF"/>
+          <w:lang w:bidi="he-IL"/>
+        </w:rPr>
+        <w:t xml:space="preserve">Golf Committee </w:t>
+      </w:r>
+      <w:r>
+        <w:rPr>
+          <w:rFonts w:eastAsiaTheme="minorEastAsia"/>
+          <w:u w:val="single"/>
+          <w:shd w:val="clear" w:color="auto" w:fill="FFFFFF"/>
+          <w:lang w:bidi="he-IL"/>
+        </w:rPr>
+        <w:t xml:space="preserve">- </w:t>
+      </w:r>
+      <w:r>
+        <w:rPr>
+          <w:sz w:val="22"/>
+          <w:szCs w:val="22"/>
+        </w:rPr>
+        <w:t>Schedule and coordinate</w:t>
+      </w:r>
+      <w:r>
+        <w:rPr>
+          <w:sz w:val="22"/>
+          <w:szCs w:val="22"/>
+        </w:rPr>
+        <w:t xml:space="preserve"> annual</w:t>
+      </w:r>
+      <w:r>
+        <w:rPr>
+          <w:sz w:val="22"/>
+          <w:szCs w:val="22"/>
+        </w:rPr>
+        <w:t xml:space="preserve"> </w:t>
+      </w:r>
+      <w:r>
+        <w:rPr>
+          <w:sz w:val="22"/>
+          <w:szCs w:val="22"/>
+        </w:rPr>
+        <w:t>golf tournament- typically in autumn.</w:t>
+      </w:r>
+    </w:p>
+    <w:p>
+      <w:pPr>
+        <w:rPr>
+          <w:sz w:val="22"/>
+          <w:szCs w:val="22"/>
+        </w:rPr>
+      </w:pPr>
+    </w:p>
+    <w:p>
+      <w:pPr>
+        <w:rPr>
+          <w:sz w:val="22"/>
+          <w:szCs w:val="22"/>
+        </w:rPr>
+      </w:pPr>
+      <w:r>
+        <w:rPr>
+          <w:rFonts w:eastAsiaTheme="minorEastAsia"/>
+          <w:u w:val="single"/>
+          <w:shd w:val="clear" w:color="auto" w:fill="FFFFFF"/>
+          <w:lang w:bidi="he-IL"/>
+        </w:rPr>
+        <w:t>Membership Committee</w:t>
+      </w:r>
+      <w:r>
+        <w:rPr>
+          <w:rFonts w:eastAsiaTheme="minorEastAsia"/>
+          <w:u w:val="single"/>
+          <w:shd w:val="clear" w:color="auto" w:fill="FFFFFF"/>
+          <w:lang w:bidi="he-IL"/>
+        </w:rPr>
+        <w:t xml:space="preserve">- </w:t>
+      </w:r>
+      <w:r>
+        <w:rPr>
+          <w:sz w:val="22"/>
+          <w:szCs w:val="22"/>
+        </w:rPr>
+        <w:t>Maintain updated Membership List for review at meetings.  New member drives and applications.  Facilitate Club communications to members from Officers and Committees.</w:t>
+      </w:r>
+    </w:p>
+    <w:p>
+      <w:pPr>
+        <w:rPr>
+          <w:rFonts w:eastAsiaTheme="minorEastAsia"/>
+          <w:sz w:val="22"/>
+          <w:szCs w:val="22"/>
+          <w:shd w:val="clear" w:color="auto" w:fill="FFFFFF"/>
+          <w:lang w:bidi="he-IL"/>
+        </w:rPr>
+      </w:pPr>
+    </w:p>
+    <w:p>
+      <w:pPr>
+        <w:rPr>
+          <w:sz w:val="22"/>
+          <w:szCs w:val="22"/>
+        </w:rPr>
+      </w:pPr>
+      <w:r>
+        <w:rPr>
+          <w:rFonts w:eastAsiaTheme="minorEastAsia"/>
+          <w:u w:val="single"/>
+          <w:shd w:val="clear" w:color="auto" w:fill="FFFFFF"/>
+          <w:lang w:bidi="he-IL"/>
+        </w:rPr>
+        <w:t xml:space="preserve">New Fund Raising Committee </w:t>
+      </w:r>
+      <w:r>
+        <w:rPr>
+          <w:rFonts w:eastAsiaTheme="minorEastAsia"/>
+          <w:u w:val="single"/>
+          <w:shd w:val="clear" w:color="auto" w:fill="FFFFFF"/>
+          <w:lang w:bidi="he-IL"/>
+        </w:rPr>
+        <w:t xml:space="preserve">- </w:t>
+      </w:r>
+      <w:r>
+        <w:rPr>
+          <w:sz w:val="22"/>
+          <w:szCs w:val="22"/>
+        </w:rPr>
+        <w:t>Investigate and pursue new fundraising opportunities.</w:t>
+      </w:r>
+    </w:p>
+    <w:p>
+      <w:pPr>
+        <w:rPr>
+          <w:rFonts w:eastAsiaTheme="minorEastAsia"/>
+          <w:sz w:val="22"/>
+          <w:szCs w:val="22"/>
+          <w:shd w:val="clear" w:color="auto" w:fill="FFFFFF"/>
+          <w:lang w:bidi="he-IL"/>
+        </w:rPr>
+      </w:pPr>
+    </w:p>
+    <w:p>
+      <w:pPr>
+        <w:rPr>
+          <w:sz w:val="22"/>
+          <w:szCs w:val="22"/>
+        </w:rPr>
+      </w:pPr>
+      <w:r>
+        <w:rPr>
+          <w:rFonts w:eastAsiaTheme="minorEastAsia"/>
+          <w:u w:val="single"/>
+          <w:shd w:val="clear" w:color="auto" w:fill="FFFFFF"/>
+          <w:lang w:bidi="he-IL"/>
+        </w:rPr>
+        <w:t>New Projects Committee</w:t>
+      </w:r>
+      <w:r>
+        <w:rPr>
+          <w:rFonts w:eastAsiaTheme="minorEastAsia"/>
+          <w:u w:val="single"/>
+          <w:shd w:val="clear" w:color="auto" w:fill="FFFFFF"/>
+          <w:lang w:bidi="he-IL"/>
+        </w:rPr>
+        <w:t xml:space="preserve">- </w:t>
+      </w:r>
+      <w:r>
+        <w:rPr>
+          <w:sz w:val="22"/>
+          <w:szCs w:val="22"/>
+        </w:rPr>
+        <w:t>Review potential new Club expenditures and propose Committee approved projects, with the necessary detail, at Club meetings for vote.</w:t>
+      </w:r>
+    </w:p>
+    <w:p>
+      <w:pPr>
+        <w:rPr>
+          <w:rFonts w:eastAsiaTheme="minorEastAsia"/>
+          <w:sz w:val="22"/>
+          <w:szCs w:val="22"/>
+          <w:shd w:val="clear" w:color="auto" w:fill="FFFFFF"/>
+          <w:lang w:bidi="he-IL"/>
+        </w:rPr>
+      </w:pPr>
+    </w:p>
+    <w:p>
+      <w:pPr>
+        <w:rPr>
+          <w:rFonts w:eastAsiaTheme="minorEastAsia"/>
+          <w:sz w:val="22"/>
+          <w:szCs w:val="22"/>
+          <w:shd w:val="clear" w:color="auto" w:fill="FFFFFF"/>
+          <w:lang w:bidi="he-IL"/>
+        </w:rPr>
+      </w:pPr>
+      <w:r>
+        <w:rPr>
+          <w:rFonts w:eastAsiaTheme="minorEastAsia"/>
+          <w:u w:val="single"/>
+          <w:shd w:val="clear" w:color="auto" w:fill="FFFFFF"/>
+          <w:lang w:bidi="he-IL"/>
+        </w:rPr>
+        <w:t xml:space="preserve">Public Relations Committee </w:t>
+      </w:r>
+      <w:r>
+        <w:rPr>
+          <w:rFonts w:eastAsiaTheme="minorEastAsia"/>
+          <w:u w:val="single"/>
+          <w:shd w:val="clear" w:color="auto" w:fill="FFFFFF"/>
+          <w:lang w:bidi="he-IL"/>
+        </w:rPr>
+        <w:t xml:space="preserve">- </w:t>
+      </w:r>
+      <w:r>
+        <w:rPr>
+          <w:sz w:val="22"/>
+          <w:szCs w:val="22"/>
+        </w:rPr>
+        <w:t>Promote the Club within the community via available means (newspaper articles</w:t>
+      </w:r>
+      <w:r>
+        <w:rPr>
+          <w:sz w:val="22"/>
+          <w:szCs w:val="22"/>
+        </w:rPr>
+        <w:t xml:space="preserve">, </w:t>
+      </w:r>
+      <w:r>
+        <w:rPr>
+          <w:sz w:val="22"/>
+          <w:szCs w:val="22"/>
+        </w:rPr>
+        <w:t>online</w:t>
+      </w:r>
+      <w:r>
+        <w:rPr>
+          <w:sz w:val="22"/>
+          <w:szCs w:val="22"/>
+        </w:rPr>
+        <w:t xml:space="preserve"> </w:t>
+      </w:r>
+      <w:r>
+        <w:rPr>
+          <w:sz w:val="22"/>
+          <w:szCs w:val="22"/>
+        </w:rPr>
+        <w:t>etc.) to encourage new membership, build good will between the Club and community, and further the opportunities to raise funds and support athletics programs.</w:t>
+      </w:r>
+    </w:p>
+    <w:p>
+      <w:pPr>
+        <w:rPr>
+          <w:rFonts w:eastAsiaTheme="minorEastAsia"/>
+          <w:shd w:val="clear" w:color="auto" w:fill="FFFFFF"/>
+          <w:lang w:bidi="he-IL"/>
+        </w:rPr>
+      </w:pPr>
+    </w:p>
+    <w:p>
+      <w:pPr>
+        <w:rPr>
+          <w:rFonts w:eastAsiaTheme="minorEastAsia"/>
+          <w:sz w:val="22"/>
+          <w:szCs w:val="22"/>
+          <w:shd w:val="clear" w:color="auto" w:fill="FFFFFF"/>
+          <w:lang w:bidi="he-IL"/>
+        </w:rPr>
+      </w:pPr>
+      <w:r>
+        <w:rPr>
+          <w:rFonts w:eastAsiaTheme="minorEastAsia"/>
+          <w:u w:val="single"/>
+          <w:shd w:val="clear" w:color="auto" w:fill="FFFFFF"/>
+          <w:lang w:bidi="he-IL"/>
+        </w:rPr>
+        <w:t>Scholarship Committee</w:t>
+      </w:r>
+      <w:r>
+        <w:rPr>
+          <w:rFonts w:eastAsiaTheme="minorEastAsia"/>
+          <w:u w:val="single"/>
+          <w:shd w:val="clear" w:color="auto" w:fill="FFFFFF"/>
+          <w:lang w:bidi="he-IL"/>
+        </w:rPr>
+        <w:t xml:space="preserve">- </w:t>
+      </w:r>
+      <w:r>
+        <w:rPr>
+          <w:sz w:val="22"/>
+          <w:szCs w:val="22"/>
+        </w:rPr>
+        <w:t>Make applications available to students.  Review candidates and select Recipients.  Advise recipients of requirements for disbursement of funds.  Provide annual awards, such as Athletes of the Year and Academic Achievement</w:t>
+      </w:r>
+      <w:r>
+        <w:rPr>
+          <w:sz w:val="22"/>
+          <w:szCs w:val="22"/>
+        </w:rPr>
+        <w:t xml:space="preserve"> </w:t>
+      </w:r>
+      <w:r>
+        <w:rPr>
+          <w:sz w:val="22"/>
+          <w:szCs w:val="22"/>
+        </w:rPr>
+        <w:t>and</w:t>
+      </w:r>
+      <w:r>
+        <w:rPr>
+          <w:sz w:val="22"/>
+          <w:szCs w:val="22"/>
+        </w:rPr>
+        <w:t xml:space="preserve"> the Coach Camp Memorial Scholarship</w:t>
+      </w:r>
+    </w:p>
+    <w:p>
+      <w:pPr>
+        <w:rPr>
+          <w:rFonts w:eastAsiaTheme="minorEastAsia"/>
+          <w:sz w:val="22"/>
+          <w:szCs w:val="22"/>
+          <w:shd w:val="clear" w:color="auto" w:fill="FFFFFF"/>
+          <w:lang w:bidi="he-IL"/>
+        </w:rPr>
+      </w:pPr>
+    </w:p>
+    <w:p>
+      <w:pPr>
+        <w:rPr>
+          <w:sz w:val="22"/>
+          <w:szCs w:val="22"/>
+        </w:rPr>
+      </w:pPr>
+      <w:r>
+        <w:rPr>
+          <w:rFonts w:eastAsiaTheme="minorEastAsia"/>
+          <w:u w:val="single"/>
+          <w:shd w:val="clear" w:color="auto" w:fill="FFFFFF"/>
+          <w:lang w:bidi="he-IL"/>
+        </w:rPr>
+        <w:t xml:space="preserve">Sunshine Committee </w:t>
+      </w:r>
+      <w:r>
+        <w:rPr>
+          <w:rFonts w:eastAsiaTheme="minorEastAsia"/>
+          <w:u w:val="single"/>
+          <w:shd w:val="clear" w:color="auto" w:fill="FFFFFF"/>
+          <w:lang w:bidi="he-IL"/>
+        </w:rPr>
+        <w:t xml:space="preserve">- </w:t>
+      </w:r>
+      <w:r>
+        <w:rPr>
+          <w:sz w:val="22"/>
+          <w:szCs w:val="22"/>
+        </w:rPr>
+        <w:t xml:space="preserve">Provide cheer, encouragement, to Members regarding health or similar issues, consolation to members on the loss of immediate family members, or to the Members family upon their loss.  </w:t>
+      </w:r>
+    </w:p>
+    <w:p>
+      <w:pPr>
+        <w:rPr>
+          <w:sz w:val="22"/>
+          <w:szCs w:val="22"/>
+        </w:rPr>
+      </w:pPr>
+    </w:p>
+    <w:p>
+      <w:pPr>
+        <w:rPr>
+          <w:rFonts w:eastAsiaTheme="minorEastAsia"/>
+          <w:sz w:val="22"/>
+          <w:szCs w:val="22"/>
+          <w:shd w:val="clear" w:color="auto" w:fill="FFFFFF"/>
+          <w:lang w:bidi="he-IL"/>
+        </w:rPr>
+      </w:pPr>
+    </w:p>
+    <w:p>
+      <w:pPr>
+        <w:rPr>
+          <w:sz w:val="22"/>
+          <w:szCs w:val="22"/>
+        </w:rPr>
+      </w:pPr>
+    </w:p>
+    <w:p>
+      <w:pPr>
+        <w:rPr>
+          <w:sz w:val="22"/>
+          <w:szCs w:val="22"/>
+        </w:rPr>
+      </w:pPr>
+    </w:p>
+    <w:p>
+      <w:pPr>
         <w:rPr>
           <w:sz w:val="16"/>
           <w:szCs w:val="16"/>
@@ -839,1191 +1774,6 @@
     </w:p>
     <w:p>
       <w:pPr>
-        <w:ind w:left="7200" w:firstLine="720"/>
-        <w:jc w:val="center"/>
-        <w:rPr>
-          <w:sz w:val="16"/>
-          <w:szCs w:val="16"/>
-        </w:rPr>
-      </w:pPr>
-    </w:p>
-    <w:p>
-      <w:pPr>
-        <w:ind w:left="7200" w:firstLine="720"/>
-        <w:jc w:val="center"/>
-        <w:rPr>
-          <w:sz w:val="16"/>
-          <w:szCs w:val="16"/>
-        </w:rPr>
-      </w:pPr>
-    </w:p>
-    <w:p>
-      <w:pPr>
-        <w:ind w:left="7200" w:firstLine="720"/>
-        <w:jc w:val="center"/>
-        <w:rPr>
-          <w:sz w:val="16"/>
-          <w:szCs w:val="16"/>
-        </w:rPr>
-      </w:pPr>
-    </w:p>
-    <w:p>
-      <w:pPr>
-        <w:ind w:left="7200" w:firstLine="720"/>
-        <w:jc w:val="center"/>
-        <w:rPr>
-          <w:sz w:val="16"/>
-          <w:szCs w:val="16"/>
-        </w:rPr>
-      </w:pPr>
-    </w:p>
-    <w:p>
-      <w:pPr>
-        <w:ind w:left="7200" w:firstLine="720"/>
-        <w:jc w:val="center"/>
-        <w:rPr>
-          <w:sz w:val="16"/>
-          <w:szCs w:val="16"/>
-        </w:rPr>
-      </w:pPr>
-    </w:p>
-    <w:p>
-      <w:pPr>
-        <w:ind w:left="7200" w:firstLine="720"/>
-        <w:jc w:val="center"/>
-        <w:rPr>
-          <w:sz w:val="16"/>
-          <w:szCs w:val="16"/>
-        </w:rPr>
-      </w:pPr>
-    </w:p>
-    <w:p>
-      <w:pPr>
-        <w:ind w:left="7200" w:firstLine="720"/>
-        <w:jc w:val="center"/>
-        <w:rPr>
-          <w:sz w:val="16"/>
-          <w:szCs w:val="16"/>
-        </w:rPr>
-      </w:pPr>
-    </w:p>
-    <w:p>
-      <w:pPr>
-        <w:ind w:left="7200" w:firstLine="720"/>
-        <w:jc w:val="center"/>
-        <w:rPr>
-          <w:sz w:val="16"/>
-          <w:szCs w:val="16"/>
-        </w:rPr>
-      </w:pPr>
-    </w:p>
-    <w:p>
-      <w:pPr>
-        <w:ind w:left="7200" w:firstLine="720"/>
-        <w:jc w:val="center"/>
-        <w:rPr>
-          <w:sz w:val="16"/>
-          <w:szCs w:val="16"/>
-        </w:rPr>
-      </w:pPr>
-      <w:r>
-        <w:rPr>
-          <w:sz w:val="16"/>
-          <w:szCs w:val="16"/>
-        </w:rPr>
-        <w:t>Rev</w:t>
-      </w:r>
-      <w:r>
-        <w:rPr>
-          <w:sz w:val="16"/>
-          <w:szCs w:val="16"/>
-        </w:rPr>
-        <w:t xml:space="preserve"> </w:t>
-      </w:r>
-      <w:r>
-        <w:rPr>
-          <w:sz w:val="16"/>
-          <w:szCs w:val="16"/>
-        </w:rPr>
-        <w:t>2: 01/04/2024</w:t>
-      </w:r>
-    </w:p>
-    <w:p>
-      <w:pPr>
-        <w:rPr>
-          <w:sz w:val="36"/>
-          <w:szCs w:val="36"/>
-          <w:u w:val="single"/>
-        </w:rPr>
-      </w:pPr>
-      <w:r>
-        <w:rPr>
-          <w:sz w:val="32"/>
-          <w:szCs w:val="32"/>
-          <w:u w:val="single"/>
-        </w:rPr>
-        <w:br w:type="page"/>
-      </w:r>
-      <w:r>
-        <w:rPr>
-          <w:sz w:val="32"/>
-          <w:szCs w:val="32"/>
-          <w:u w:val="single"/>
-        </w:rPr>
-        <w:lastRenderedPageBreak/>
-        <w:t xml:space="preserve">BENCHWARMERS </w:t>
-      </w:r>
-      <w:r>
-        <w:rPr>
-          <w:sz w:val="36"/>
-          <w:szCs w:val="36"/>
-          <w:u w:val="single"/>
-        </w:rPr>
-        <w:t>Committees</w:t>
-      </w:r>
-    </w:p>
-    <w:p>
-      <w:pPr>
-        <w:jc w:val="center"/>
-        <w:rPr>
-          <w:sz w:val="32"/>
-          <w:szCs w:val="32"/>
-          <w:u w:val="single"/>
-        </w:rPr>
-      </w:pPr>
-    </w:p>
-    <w:p>
-      <w:pPr>
-        <w:rPr>
-          <w:rFonts w:eastAsiaTheme="minorEastAsia"/>
-          <w:u w:val="single"/>
-          <w:shd w:val="clear" w:color="auto" w:fill="FFFFFF"/>
-          <w:lang w:bidi="he-IL"/>
-        </w:rPr>
-      </w:pPr>
-    </w:p>
-    <w:p>
-      <w:pPr>
-        <w:rPr>
-          <w:rFonts w:eastAsiaTheme="minorEastAsia"/>
-          <w:shd w:val="clear" w:color="auto" w:fill="FFFFFF"/>
-          <w:lang w:bidi="he-IL"/>
-        </w:rPr>
-      </w:pPr>
-      <w:r>
-        <w:rPr>
-          <w:rFonts w:eastAsiaTheme="minorEastAsia"/>
-          <w:u w:val="single"/>
-          <w:shd w:val="clear" w:color="auto" w:fill="FFFFFF"/>
-          <w:lang w:bidi="he-IL"/>
-        </w:rPr>
-        <w:t xml:space="preserve">Alumni Game Committee- </w:t>
-      </w:r>
-      <w:r>
-        <w:rPr>
-          <w:rFonts w:eastAsiaTheme="minorEastAsia"/>
-          <w:shd w:val="clear" w:color="auto" w:fill="FFFFFF"/>
-          <w:lang w:bidi="he-IL"/>
-        </w:rPr>
-        <w:t>Schedule and help coordinate Alumn</w:t>
-      </w:r>
-      <w:r>
-        <w:rPr>
-          <w:rFonts w:eastAsiaTheme="minorEastAsia"/>
-          <w:shd w:val="clear" w:color="auto" w:fill="FFFFFF"/>
-          <w:lang w:bidi="he-IL"/>
-        </w:rPr>
-        <w:t>i bask</w:t>
-      </w:r>
-      <w:r>
-        <w:rPr>
-          <w:rFonts w:eastAsiaTheme="minorEastAsia"/>
-          <w:shd w:val="clear" w:color="auto" w:fill="FFFFFF"/>
-          <w:lang w:bidi="he-IL"/>
-        </w:rPr>
-        <w:t xml:space="preserve">etball game- typically in late </w:t>
-      </w:r>
-      <w:r>
-        <w:rPr>
-          <w:rFonts w:eastAsiaTheme="minorEastAsia"/>
-          <w:shd w:val="clear" w:color="auto" w:fill="FFFFFF"/>
-          <w:lang w:bidi="he-IL"/>
-        </w:rPr>
-        <w:t>autumn</w:t>
-      </w:r>
-      <w:r>
-        <w:rPr>
-          <w:rFonts w:eastAsiaTheme="minorEastAsia"/>
-          <w:shd w:val="clear" w:color="auto" w:fill="FFFFFF"/>
-          <w:lang w:bidi="he-IL"/>
-        </w:rPr>
-        <w:t>.</w:t>
-      </w:r>
-    </w:p>
-    <w:p>
-      <w:pPr>
-        <w:rPr>
-          <w:rFonts w:eastAsiaTheme="minorEastAsia"/>
-          <w:u w:val="single"/>
-          <w:shd w:val="clear" w:color="auto" w:fill="FFFFFF"/>
-          <w:lang w:bidi="he-IL"/>
-        </w:rPr>
-      </w:pPr>
-    </w:p>
-    <w:p>
-      <w:pPr>
-        <w:rPr>
-          <w:sz w:val="22"/>
-          <w:szCs w:val="22"/>
-        </w:rPr>
-      </w:pPr>
-      <w:r>
-        <w:rPr>
-          <w:rFonts w:eastAsiaTheme="minorEastAsia"/>
-          <w:u w:val="single"/>
-          <w:shd w:val="clear" w:color="auto" w:fill="FFFFFF"/>
-          <w:lang w:bidi="he-IL"/>
-        </w:rPr>
-        <w:t xml:space="preserve">Basketball Program Committee </w:t>
-      </w:r>
-      <w:r>
-        <w:rPr>
-          <w:rFonts w:eastAsiaTheme="minorEastAsia"/>
-          <w:u w:val="single"/>
-          <w:shd w:val="clear" w:color="auto" w:fill="FFFFFF"/>
-          <w:lang w:bidi="he-IL"/>
-        </w:rPr>
-        <w:t xml:space="preserve">- </w:t>
-      </w:r>
-      <w:r>
-        <w:rPr>
-          <w:sz w:val="22"/>
-          <w:szCs w:val="22"/>
-        </w:rPr>
-        <w:t>Generate an annual printed program for the Basketball teams to be distributed at home games.  Sell advertising space within the program to pay/offset the cost of producing the program.</w:t>
-      </w:r>
-    </w:p>
-    <w:p>
-      <w:pPr>
-        <w:rPr>
-          <w:rFonts w:eastAsiaTheme="minorEastAsia"/>
-          <w:sz w:val="22"/>
-          <w:szCs w:val="22"/>
-          <w:shd w:val="clear" w:color="auto" w:fill="FFFFFF"/>
-          <w:lang w:bidi="he-IL"/>
-        </w:rPr>
-      </w:pPr>
-    </w:p>
-    <w:p>
-      <w:pPr>
-        <w:rPr>
-          <w:sz w:val="22"/>
-          <w:szCs w:val="22"/>
-        </w:rPr>
-      </w:pPr>
-      <w:r>
-        <w:rPr>
-          <w:rFonts w:eastAsiaTheme="minorEastAsia"/>
-          <w:u w:val="single"/>
-          <w:shd w:val="clear" w:color="auto" w:fill="FFFFFF"/>
-          <w:lang w:bidi="he-IL"/>
-        </w:rPr>
-        <w:t xml:space="preserve">Awards Committee </w:t>
-      </w:r>
-      <w:r>
-        <w:rPr>
-          <w:rFonts w:eastAsiaTheme="minorEastAsia"/>
-          <w:sz w:val="22"/>
-          <w:szCs w:val="22"/>
-          <w:shd w:val="clear" w:color="auto" w:fill="FFFFFF"/>
-          <w:lang w:bidi="he-IL"/>
-        </w:rPr>
-        <w:t>–</w:t>
-      </w:r>
-      <w:r>
-        <w:rPr>
-          <w:rFonts w:eastAsiaTheme="minorEastAsia"/>
-          <w:sz w:val="22"/>
-          <w:szCs w:val="22"/>
-          <w:shd w:val="clear" w:color="auto" w:fill="FFFFFF"/>
-          <w:lang w:bidi="he-IL"/>
-        </w:rPr>
-        <w:t xml:space="preserve"> </w:t>
-      </w:r>
-      <w:r>
-        <w:rPr>
-          <w:rFonts w:eastAsiaTheme="minorEastAsia"/>
-          <w:sz w:val="22"/>
-          <w:szCs w:val="22"/>
-          <w:shd w:val="clear" w:color="auto" w:fill="FFFFFF"/>
-          <w:lang w:bidi="he-IL"/>
-        </w:rPr>
-        <w:t>Support the</w:t>
-      </w:r>
-      <w:r>
-        <w:rPr>
-          <w:rFonts w:eastAsiaTheme="minorEastAsia"/>
-          <w:u w:val="single"/>
-          <w:shd w:val="clear" w:color="auto" w:fill="FFFFFF"/>
-          <w:lang w:bidi="he-IL"/>
-        </w:rPr>
-        <w:t xml:space="preserve"> </w:t>
-      </w:r>
-      <w:r>
-        <w:rPr>
-          <w:sz w:val="22"/>
-          <w:szCs w:val="22"/>
-        </w:rPr>
-        <w:t xml:space="preserve">Awards </w:t>
-      </w:r>
-      <w:r>
-        <w:rPr>
-          <w:sz w:val="22"/>
-          <w:szCs w:val="22"/>
-        </w:rPr>
-        <w:t>Ceremony</w:t>
-      </w:r>
-      <w:r>
-        <w:rPr>
-          <w:sz w:val="22"/>
-          <w:szCs w:val="22"/>
-        </w:rPr>
-        <w:t xml:space="preserve"> for all interscholastic sports teams, including, opportunities for individual and team recognitions.  Provide awards such as congratulatory items, team banquets/outings, ot</w:t>
-      </w:r>
-      <w:r>
-        <w:rPr>
-          <w:sz w:val="22"/>
-          <w:szCs w:val="22"/>
-        </w:rPr>
-        <w:t>her recognitions</w:t>
-      </w:r>
-      <w:r>
-        <w:rPr>
-          <w:sz w:val="22"/>
-          <w:szCs w:val="22"/>
-        </w:rPr>
-        <w:t xml:space="preserve"> for Championship teams (Shoreline League or State Championship) as specified in previously established procedures/guidelines.</w:t>
-      </w:r>
-    </w:p>
-    <w:p>
-      <w:pPr>
-        <w:rPr>
-          <w:rFonts w:eastAsiaTheme="minorEastAsia"/>
-          <w:sz w:val="22"/>
-          <w:szCs w:val="22"/>
-          <w:shd w:val="clear" w:color="auto" w:fill="FFFFFF"/>
-          <w:lang w:bidi="he-IL"/>
-        </w:rPr>
-      </w:pPr>
-    </w:p>
-    <w:p>
-      <w:pPr>
-        <w:rPr>
-          <w:sz w:val="22"/>
-          <w:szCs w:val="22"/>
-        </w:rPr>
-      </w:pPr>
-      <w:r>
-        <w:rPr>
-          <w:rFonts w:eastAsiaTheme="minorEastAsia"/>
-          <w:u w:val="single"/>
-          <w:shd w:val="clear" w:color="auto" w:fill="FFFFFF"/>
-          <w:lang w:bidi="he-IL"/>
-        </w:rPr>
-        <w:t xml:space="preserve">By-Laws Committee </w:t>
-      </w:r>
-      <w:r>
-        <w:rPr>
-          <w:rFonts w:eastAsiaTheme="minorEastAsia"/>
-          <w:u w:val="single"/>
-          <w:shd w:val="clear" w:color="auto" w:fill="FFFFFF"/>
-          <w:lang w:bidi="he-IL"/>
-        </w:rPr>
-        <w:t xml:space="preserve">- </w:t>
-      </w:r>
-      <w:r>
-        <w:rPr>
-          <w:sz w:val="22"/>
-          <w:szCs w:val="22"/>
-        </w:rPr>
-        <w:t>Maintain Bylaws document and update changes.  Report status annually.</w:t>
-      </w:r>
-    </w:p>
-    <w:p>
-      <w:pPr>
-        <w:rPr>
-          <w:rFonts w:eastAsiaTheme="minorEastAsia"/>
-          <w:u w:val="single"/>
-          <w:shd w:val="clear" w:color="auto" w:fill="FFFFFF"/>
-          <w:lang w:bidi="he-IL"/>
-        </w:rPr>
-      </w:pPr>
-    </w:p>
-    <w:p>
-      <w:pPr>
-        <w:rPr>
-          <w:rFonts w:eastAsiaTheme="minorEastAsia"/>
-          <w:sz w:val="22"/>
-          <w:szCs w:val="22"/>
-          <w:shd w:val="clear" w:color="auto" w:fill="FFFFFF"/>
-          <w:lang w:bidi="he-IL"/>
-        </w:rPr>
-      </w:pPr>
-      <w:r>
-        <w:rPr>
-          <w:rFonts w:eastAsiaTheme="minorEastAsia"/>
-          <w:u w:val="single"/>
-          <w:shd w:val="clear" w:color="auto" w:fill="FFFFFF"/>
-          <w:lang w:bidi="he-IL"/>
-        </w:rPr>
-        <w:t xml:space="preserve">Concessions Committee </w:t>
-      </w:r>
-      <w:r>
-        <w:rPr>
-          <w:rFonts w:eastAsiaTheme="minorEastAsia"/>
-          <w:u w:val="single"/>
-          <w:shd w:val="clear" w:color="auto" w:fill="FFFFFF"/>
-          <w:lang w:bidi="he-IL"/>
-        </w:rPr>
-        <w:t xml:space="preserve">- </w:t>
-      </w:r>
-      <w:r>
-        <w:rPr>
-          <w:sz w:val="22"/>
-          <w:szCs w:val="22"/>
-        </w:rPr>
-        <w:t xml:space="preserve">Sell food, drink, or souvenir items at CIAC contests </w:t>
-      </w:r>
-      <w:r>
-        <w:rPr>
-          <w:sz w:val="22"/>
-          <w:szCs w:val="22"/>
-        </w:rPr>
-        <w:t>on CRHS premises</w:t>
-      </w:r>
-      <w:r>
-        <w:rPr>
-          <w:sz w:val="22"/>
-          <w:szCs w:val="22"/>
-        </w:rPr>
-        <w:t xml:space="preserve"> </w:t>
-      </w:r>
-      <w:r>
-        <w:rPr>
-          <w:sz w:val="22"/>
-          <w:szCs w:val="22"/>
-        </w:rPr>
-        <w:t>for</w:t>
-      </w:r>
-      <w:r>
-        <w:rPr>
-          <w:sz w:val="22"/>
-          <w:szCs w:val="22"/>
-        </w:rPr>
-        <w:t xml:space="preserve"> boys</w:t>
-      </w:r>
-      <w:r>
-        <w:rPr>
-          <w:sz w:val="22"/>
-          <w:szCs w:val="22"/>
-        </w:rPr>
-        <w:t xml:space="preserve"> &amp; girls</w:t>
-      </w:r>
-      <w:r>
-        <w:rPr>
-          <w:sz w:val="22"/>
-          <w:szCs w:val="22"/>
-        </w:rPr>
-        <w:t xml:space="preserve"> and home basketball games</w:t>
-      </w:r>
-      <w:r>
-        <w:rPr>
-          <w:sz w:val="22"/>
-          <w:szCs w:val="22"/>
-        </w:rPr>
-        <w:t>,</w:t>
-      </w:r>
-      <w:r>
-        <w:rPr>
-          <w:sz w:val="22"/>
-          <w:szCs w:val="22"/>
-        </w:rPr>
-        <w:t xml:space="preserve"> including</w:t>
-      </w:r>
-      <w:r>
-        <w:rPr>
-          <w:sz w:val="22"/>
-          <w:szCs w:val="22"/>
-        </w:rPr>
-        <w:t xml:space="preserve"> </w:t>
-      </w:r>
-      <w:r>
-        <w:rPr>
-          <w:sz w:val="22"/>
-          <w:szCs w:val="22"/>
-        </w:rPr>
-        <w:t>food and supply ordering,</w:t>
-      </w:r>
-    </w:p>
-    <w:p>
-      <w:pPr>
-        <w:rPr>
-          <w:rFonts w:eastAsiaTheme="minorEastAsia"/>
-          <w:u w:val="single"/>
-          <w:shd w:val="clear" w:color="auto" w:fill="FFFFFF"/>
-          <w:lang w:bidi="he-IL"/>
-        </w:rPr>
-      </w:pPr>
-    </w:p>
-    <w:p>
-      <w:pPr>
-        <w:rPr>
-          <w:sz w:val="22"/>
-          <w:szCs w:val="22"/>
-        </w:rPr>
-      </w:pPr>
-      <w:r>
-        <w:rPr>
-          <w:rFonts w:eastAsiaTheme="minorEastAsia"/>
-          <w:u w:val="single"/>
-          <w:shd w:val="clear" w:color="auto" w:fill="FFFFFF"/>
-          <w:lang w:bidi="he-IL"/>
-        </w:rPr>
-        <w:t xml:space="preserve">Durham Fair Committee </w:t>
-      </w:r>
-      <w:r>
-        <w:rPr>
-          <w:rFonts w:eastAsiaTheme="minorEastAsia"/>
-          <w:u w:val="single"/>
-          <w:shd w:val="clear" w:color="auto" w:fill="FFFFFF"/>
-          <w:lang w:bidi="he-IL"/>
-        </w:rPr>
-        <w:t xml:space="preserve">- </w:t>
-      </w:r>
-      <w:r>
-        <w:rPr>
-          <w:sz w:val="22"/>
-          <w:szCs w:val="22"/>
-        </w:rPr>
-        <w:t>Sell food, drink, or souvenir items at the Durham Fair.  Coordinate booth and equipment maintenance and readiness, food and supply ordering, and member/volunteer participation.</w:t>
-      </w:r>
-    </w:p>
-    <w:p>
-      <w:pPr>
-        <w:rPr>
-          <w:rFonts w:eastAsiaTheme="minorEastAsia"/>
-          <w:sz w:val="22"/>
-          <w:szCs w:val="22"/>
-          <w:shd w:val="clear" w:color="auto" w:fill="FFFFFF"/>
-          <w:lang w:bidi="he-IL"/>
-        </w:rPr>
-      </w:pPr>
-    </w:p>
-    <w:p>
-      <w:pPr>
-        <w:rPr>
-          <w:sz w:val="22"/>
-          <w:szCs w:val="22"/>
-        </w:rPr>
-      </w:pPr>
-      <w:r>
-        <w:rPr>
-          <w:rFonts w:eastAsiaTheme="minorEastAsia"/>
-          <w:u w:val="single"/>
-          <w:shd w:val="clear" w:color="auto" w:fill="FFFFFF"/>
-          <w:lang w:bidi="he-IL"/>
-        </w:rPr>
-        <w:t>Entertainment</w:t>
-      </w:r>
-      <w:r>
-        <w:rPr>
-          <w:rFonts w:eastAsiaTheme="minorEastAsia"/>
-          <w:u w:val="single"/>
-          <w:shd w:val="clear" w:color="auto" w:fill="FFFFFF"/>
-          <w:lang w:bidi="he-IL"/>
-        </w:rPr>
-        <w:t xml:space="preserve">- </w:t>
-      </w:r>
-      <w:r>
-        <w:rPr>
-          <w:sz w:val="22"/>
-          <w:szCs w:val="22"/>
-        </w:rPr>
-        <w:t>Suggest and coordinate activities to boost member morale and club cohesiveness.</w:t>
-      </w:r>
-    </w:p>
-    <w:p>
-      <w:pPr>
-        <w:rPr>
-          <w:sz w:val="22"/>
-          <w:szCs w:val="22"/>
-        </w:rPr>
-      </w:pPr>
-    </w:p>
-    <w:p>
-      <w:pPr>
-        <w:rPr>
-          <w:sz w:val="22"/>
-          <w:szCs w:val="22"/>
-        </w:rPr>
-      </w:pPr>
-      <w:r>
-        <w:rPr>
-          <w:u w:val="single"/>
-        </w:rPr>
-        <w:t>Fair Building Committee</w:t>
-      </w:r>
-      <w:r>
-        <w:rPr>
-          <w:sz w:val="22"/>
-          <w:szCs w:val="22"/>
-        </w:rPr>
-        <w:t xml:space="preserve"> - Maintenance, repairs, remodel, etc., to the Fair booth, as necessary, to maintain an efficient, neat, clean operation.</w:t>
-      </w:r>
-    </w:p>
-    <w:p>
-      <w:pPr>
-        <w:rPr>
-          <w:rFonts w:eastAsiaTheme="minorEastAsia"/>
-          <w:u w:val="single"/>
-          <w:shd w:val="clear" w:color="auto" w:fill="FFFFFF"/>
-          <w:lang w:bidi="he-IL"/>
-        </w:rPr>
-      </w:pPr>
-    </w:p>
-    <w:p>
-      <w:pPr>
-        <w:rPr>
-          <w:sz w:val="22"/>
-          <w:szCs w:val="22"/>
-        </w:rPr>
-      </w:pPr>
-      <w:r>
-        <w:rPr>
-          <w:rFonts w:eastAsiaTheme="minorEastAsia"/>
-          <w:u w:val="single"/>
-          <w:shd w:val="clear" w:color="auto" w:fill="FFFFFF"/>
-          <w:lang w:bidi="he-IL"/>
-        </w:rPr>
-        <w:t xml:space="preserve">Golf Committee </w:t>
-      </w:r>
-      <w:r>
-        <w:rPr>
-          <w:rFonts w:eastAsiaTheme="minorEastAsia"/>
-          <w:u w:val="single"/>
-          <w:shd w:val="clear" w:color="auto" w:fill="FFFFFF"/>
-          <w:lang w:bidi="he-IL"/>
-        </w:rPr>
-        <w:t xml:space="preserve">- </w:t>
-      </w:r>
-      <w:r>
-        <w:rPr>
-          <w:sz w:val="22"/>
-          <w:szCs w:val="22"/>
-        </w:rPr>
-        <w:t>Schedule and coordinate</w:t>
-      </w:r>
-      <w:r>
-        <w:rPr>
-          <w:sz w:val="22"/>
-          <w:szCs w:val="22"/>
-        </w:rPr>
-        <w:t xml:space="preserve"> annual</w:t>
-      </w:r>
-      <w:r>
-        <w:rPr>
-          <w:sz w:val="22"/>
-          <w:szCs w:val="22"/>
-        </w:rPr>
-        <w:t xml:space="preserve"> </w:t>
-      </w:r>
-      <w:r>
-        <w:rPr>
-          <w:sz w:val="22"/>
-          <w:szCs w:val="22"/>
-        </w:rPr>
-        <w:t>golf tournament- typically in autumn.</w:t>
-      </w:r>
-    </w:p>
-    <w:p>
-      <w:pPr>
-        <w:rPr>
-          <w:sz w:val="22"/>
-          <w:szCs w:val="22"/>
-        </w:rPr>
-      </w:pPr>
-    </w:p>
-    <w:p>
-      <w:pPr>
-        <w:rPr>
-          <w:sz w:val="22"/>
-          <w:szCs w:val="22"/>
-        </w:rPr>
-      </w:pPr>
-      <w:r>
-        <w:rPr>
-          <w:rFonts w:eastAsiaTheme="minorEastAsia"/>
-          <w:u w:val="single"/>
-          <w:shd w:val="clear" w:color="auto" w:fill="FFFFFF"/>
-          <w:lang w:bidi="he-IL"/>
-        </w:rPr>
-        <w:t>Membership Committee</w:t>
-      </w:r>
-      <w:r>
-        <w:rPr>
-          <w:rFonts w:eastAsiaTheme="minorEastAsia"/>
-          <w:u w:val="single"/>
-          <w:shd w:val="clear" w:color="auto" w:fill="FFFFFF"/>
-          <w:lang w:bidi="he-IL"/>
-        </w:rPr>
-        <w:t xml:space="preserve">- </w:t>
-      </w:r>
-      <w:r>
-        <w:rPr>
-          <w:sz w:val="22"/>
-          <w:szCs w:val="22"/>
-        </w:rPr>
-        <w:t>Maintain updated Membership List for review at meetings.  New member drives and applications.  Facilitate Club communications to members from Officers and Committees.</w:t>
-      </w:r>
-    </w:p>
-    <w:p>
-      <w:pPr>
-        <w:rPr>
-          <w:rFonts w:eastAsiaTheme="minorEastAsia"/>
-          <w:sz w:val="22"/>
-          <w:szCs w:val="22"/>
-          <w:shd w:val="clear" w:color="auto" w:fill="FFFFFF"/>
-          <w:lang w:bidi="he-IL"/>
-        </w:rPr>
-      </w:pPr>
-    </w:p>
-    <w:p>
-      <w:pPr>
-        <w:rPr>
-          <w:sz w:val="22"/>
-          <w:szCs w:val="22"/>
-        </w:rPr>
-      </w:pPr>
-      <w:r>
-        <w:rPr>
-          <w:rFonts w:eastAsiaTheme="minorEastAsia"/>
-          <w:u w:val="single"/>
-          <w:shd w:val="clear" w:color="auto" w:fill="FFFFFF"/>
-          <w:lang w:bidi="he-IL"/>
-        </w:rPr>
-        <w:t xml:space="preserve">New Fund Raising Committee </w:t>
-      </w:r>
-      <w:r>
-        <w:rPr>
-          <w:rFonts w:eastAsiaTheme="minorEastAsia"/>
-          <w:u w:val="single"/>
-          <w:shd w:val="clear" w:color="auto" w:fill="FFFFFF"/>
-          <w:lang w:bidi="he-IL"/>
-        </w:rPr>
-        <w:t xml:space="preserve">- </w:t>
-      </w:r>
-      <w:r>
-        <w:rPr>
-          <w:sz w:val="22"/>
-          <w:szCs w:val="22"/>
-        </w:rPr>
-        <w:t>Investigate and pursue new fundraising opportunities.</w:t>
-      </w:r>
-    </w:p>
-    <w:p>
-      <w:pPr>
-        <w:rPr>
-          <w:rFonts w:eastAsiaTheme="minorEastAsia"/>
-          <w:sz w:val="22"/>
-          <w:szCs w:val="22"/>
-          <w:shd w:val="clear" w:color="auto" w:fill="FFFFFF"/>
-          <w:lang w:bidi="he-IL"/>
-        </w:rPr>
-      </w:pPr>
-    </w:p>
-    <w:p>
-      <w:pPr>
-        <w:rPr>
-          <w:sz w:val="22"/>
-          <w:szCs w:val="22"/>
-        </w:rPr>
-      </w:pPr>
-      <w:r>
-        <w:rPr>
-          <w:rFonts w:eastAsiaTheme="minorEastAsia"/>
-          <w:u w:val="single"/>
-          <w:shd w:val="clear" w:color="auto" w:fill="FFFFFF"/>
-          <w:lang w:bidi="he-IL"/>
-        </w:rPr>
-        <w:t>New Projects Committee</w:t>
-      </w:r>
-      <w:r>
-        <w:rPr>
-          <w:rFonts w:eastAsiaTheme="minorEastAsia"/>
-          <w:u w:val="single"/>
-          <w:shd w:val="clear" w:color="auto" w:fill="FFFFFF"/>
-          <w:lang w:bidi="he-IL"/>
-        </w:rPr>
-        <w:t xml:space="preserve">- </w:t>
-      </w:r>
-      <w:r>
-        <w:rPr>
-          <w:sz w:val="22"/>
-          <w:szCs w:val="22"/>
-        </w:rPr>
-        <w:t>Review potential new Club expenditures and propose Committee approved projects, with the necessary detail, at Club meetings for vote.</w:t>
-      </w:r>
-    </w:p>
-    <w:p>
-      <w:pPr>
-        <w:rPr>
-          <w:rFonts w:eastAsiaTheme="minorEastAsia"/>
-          <w:sz w:val="22"/>
-          <w:szCs w:val="22"/>
-          <w:shd w:val="clear" w:color="auto" w:fill="FFFFFF"/>
-          <w:lang w:bidi="he-IL"/>
-        </w:rPr>
-      </w:pPr>
-    </w:p>
-    <w:p>
-      <w:pPr>
-        <w:rPr>
-          <w:rFonts w:eastAsiaTheme="minorEastAsia"/>
-          <w:sz w:val="22"/>
-          <w:szCs w:val="22"/>
-          <w:shd w:val="clear" w:color="auto" w:fill="FFFFFF"/>
-          <w:lang w:bidi="he-IL"/>
-        </w:rPr>
-      </w:pPr>
-      <w:r>
-        <w:rPr>
-          <w:rFonts w:eastAsiaTheme="minorEastAsia"/>
-          <w:u w:val="single"/>
-          <w:shd w:val="clear" w:color="auto" w:fill="FFFFFF"/>
-          <w:lang w:bidi="he-IL"/>
-        </w:rPr>
-        <w:t xml:space="preserve">Public Relations Committee </w:t>
-      </w:r>
-      <w:r>
-        <w:rPr>
-          <w:rFonts w:eastAsiaTheme="minorEastAsia"/>
-          <w:u w:val="single"/>
-          <w:shd w:val="clear" w:color="auto" w:fill="FFFFFF"/>
-          <w:lang w:bidi="he-IL"/>
-        </w:rPr>
-        <w:t xml:space="preserve">- </w:t>
-      </w:r>
-      <w:r>
-        <w:rPr>
-          <w:sz w:val="22"/>
-          <w:szCs w:val="22"/>
-        </w:rPr>
-        <w:t>Promote the Club within the community via available means (newspaper articles</w:t>
-      </w:r>
-      <w:r>
-        <w:rPr>
-          <w:sz w:val="22"/>
-          <w:szCs w:val="22"/>
-        </w:rPr>
-        <w:t xml:space="preserve">, </w:t>
-      </w:r>
-      <w:r>
-        <w:rPr>
-          <w:sz w:val="22"/>
-          <w:szCs w:val="22"/>
-        </w:rPr>
-        <w:t>online</w:t>
-      </w:r>
-      <w:r>
-        <w:rPr>
-          <w:sz w:val="22"/>
-          <w:szCs w:val="22"/>
-        </w:rPr>
-        <w:t xml:space="preserve"> </w:t>
-      </w:r>
-      <w:r>
-        <w:rPr>
-          <w:sz w:val="22"/>
-          <w:szCs w:val="22"/>
-        </w:rPr>
-        <w:t>etc.) to encourage new membership, build good will between the Club and community, and further the opportunities to raise funds and support athletics programs.</w:t>
-      </w:r>
-    </w:p>
-    <w:p>
-      <w:pPr>
-        <w:rPr>
-          <w:rFonts w:eastAsiaTheme="minorEastAsia"/>
-          <w:shd w:val="clear" w:color="auto" w:fill="FFFFFF"/>
-          <w:lang w:bidi="he-IL"/>
-        </w:rPr>
-      </w:pPr>
-    </w:p>
-    <w:p>
-      <w:pPr>
-        <w:rPr>
-          <w:rFonts w:eastAsiaTheme="minorEastAsia"/>
-          <w:sz w:val="22"/>
-          <w:szCs w:val="22"/>
-          <w:shd w:val="clear" w:color="auto" w:fill="FFFFFF"/>
-          <w:lang w:bidi="he-IL"/>
-        </w:rPr>
-      </w:pPr>
-      <w:r>
-        <w:rPr>
-          <w:rFonts w:eastAsiaTheme="minorEastAsia"/>
-          <w:u w:val="single"/>
-          <w:shd w:val="clear" w:color="auto" w:fill="FFFFFF"/>
-          <w:lang w:bidi="he-IL"/>
-        </w:rPr>
-        <w:t>Scholarship Committee</w:t>
-      </w:r>
-      <w:r>
-        <w:rPr>
-          <w:rFonts w:eastAsiaTheme="minorEastAsia"/>
-          <w:u w:val="single"/>
-          <w:shd w:val="clear" w:color="auto" w:fill="FFFFFF"/>
-          <w:lang w:bidi="he-IL"/>
-        </w:rPr>
-        <w:t xml:space="preserve">- </w:t>
-      </w:r>
-      <w:r>
-        <w:rPr>
-          <w:sz w:val="22"/>
-          <w:szCs w:val="22"/>
-        </w:rPr>
-        <w:t>Make applications available to students.  Review candidates and select Recipients.  Advise recipients of requirements for disbursement of funds.  Provide annual awards, such as Athletes of the Year and Academic Achievement</w:t>
-      </w:r>
-      <w:r>
-        <w:rPr>
-          <w:sz w:val="22"/>
-          <w:szCs w:val="22"/>
-        </w:rPr>
-        <w:t xml:space="preserve"> </w:t>
-      </w:r>
-      <w:r>
-        <w:rPr>
-          <w:sz w:val="22"/>
-          <w:szCs w:val="22"/>
-        </w:rPr>
-        <w:t>and</w:t>
-      </w:r>
-      <w:r>
-        <w:rPr>
-          <w:sz w:val="22"/>
-          <w:szCs w:val="22"/>
-        </w:rPr>
-        <w:t xml:space="preserve"> the Coach Camp Memorial Scholarship</w:t>
-      </w:r>
-    </w:p>
-    <w:p>
-      <w:pPr>
-        <w:rPr>
-          <w:rFonts w:eastAsiaTheme="minorEastAsia"/>
-          <w:sz w:val="22"/>
-          <w:szCs w:val="22"/>
-          <w:shd w:val="clear" w:color="auto" w:fill="FFFFFF"/>
-          <w:lang w:bidi="he-IL"/>
-        </w:rPr>
-      </w:pPr>
-    </w:p>
-    <w:p>
-      <w:pPr>
-        <w:rPr>
-          <w:sz w:val="22"/>
-          <w:szCs w:val="22"/>
-        </w:rPr>
-      </w:pPr>
-      <w:r>
-        <w:rPr>
-          <w:rFonts w:eastAsiaTheme="minorEastAsia"/>
-          <w:u w:val="single"/>
-          <w:shd w:val="clear" w:color="auto" w:fill="FFFFFF"/>
-          <w:lang w:bidi="he-IL"/>
-        </w:rPr>
-        <w:t xml:space="preserve">Sunshine Committee </w:t>
-      </w:r>
-      <w:r>
-        <w:rPr>
-          <w:rFonts w:eastAsiaTheme="minorEastAsia"/>
-          <w:u w:val="single"/>
-          <w:shd w:val="clear" w:color="auto" w:fill="FFFFFF"/>
-          <w:lang w:bidi="he-IL"/>
-        </w:rPr>
-        <w:t xml:space="preserve">- </w:t>
-      </w:r>
-      <w:r>
-        <w:rPr>
-          <w:sz w:val="22"/>
-          <w:szCs w:val="22"/>
-        </w:rPr>
-        <w:t xml:space="preserve">Provide cheer, encouragement, to Members regarding health or similar issues, consolation to members on the loss of immediate family members, or to the Members family upon their loss.  </w:t>
-      </w:r>
-    </w:p>
-    <w:p>
-      <w:pPr>
-        <w:rPr>
-          <w:sz w:val="22"/>
-          <w:szCs w:val="22"/>
-        </w:rPr>
-      </w:pPr>
-    </w:p>
-    <w:p>
-      <w:pPr>
-        <w:rPr>
-          <w:rFonts w:eastAsiaTheme="minorEastAsia"/>
-          <w:sz w:val="22"/>
-          <w:szCs w:val="22"/>
-          <w:shd w:val="clear" w:color="auto" w:fill="FFFFFF"/>
-          <w:lang w:bidi="he-IL"/>
-        </w:rPr>
-      </w:pPr>
-    </w:p>
-    <w:p>
-      <w:pPr>
-        <w:rPr>
-          <w:sz w:val="22"/>
-          <w:szCs w:val="22"/>
-        </w:rPr>
-      </w:pPr>
-    </w:p>
-    <w:p>
-      <w:pPr>
-        <w:rPr>
-          <w:sz w:val="22"/>
-          <w:szCs w:val="22"/>
-        </w:rPr>
-      </w:pPr>
-    </w:p>
-    <w:p>
-      <w:pPr>
-        <w:rPr>
-          <w:sz w:val="16"/>
-          <w:szCs w:val="16"/>
-        </w:rPr>
-      </w:pPr>
-      <w:r>
-        <w:rPr>
-          <w:sz w:val="22"/>
-          <w:szCs w:val="22"/>
-        </w:rPr>
-        <w:tab/>
-      </w:r>
-      <w:r>
-        <w:rPr>
-          <w:sz w:val="22"/>
-          <w:szCs w:val="22"/>
-        </w:rPr>
-        <w:tab/>
-      </w:r>
-      <w:r>
-        <w:rPr>
-          <w:sz w:val="22"/>
-          <w:szCs w:val="22"/>
-        </w:rPr>
-        <w:tab/>
-      </w:r>
-      <w:r>
-        <w:rPr>
-          <w:sz w:val="22"/>
-          <w:szCs w:val="22"/>
-        </w:rPr>
-        <w:tab/>
-      </w:r>
-      <w:r>
-        <w:rPr>
-          <w:sz w:val="22"/>
-          <w:szCs w:val="22"/>
-        </w:rPr>
-        <w:tab/>
-      </w:r>
-      <w:r>
-        <w:rPr>
-          <w:sz w:val="22"/>
-          <w:szCs w:val="22"/>
-        </w:rPr>
-        <w:tab/>
-      </w:r>
-      <w:r>
-        <w:rPr>
-          <w:sz w:val="22"/>
-          <w:szCs w:val="22"/>
-        </w:rPr>
-        <w:tab/>
-      </w:r>
-      <w:r>
-        <w:rPr>
-          <w:sz w:val="22"/>
-          <w:szCs w:val="22"/>
-        </w:rPr>
-        <w:tab/>
-      </w:r>
-      <w:r>
-        <w:rPr>
-          <w:sz w:val="22"/>
-          <w:szCs w:val="22"/>
-        </w:rPr>
-        <w:tab/>
-      </w:r>
-      <w:r>
-        <w:rPr>
-          <w:sz w:val="22"/>
-          <w:szCs w:val="22"/>
-        </w:rPr>
-        <w:tab/>
-      </w:r>
-      <w:r>
-        <w:rPr>
-          <w:sz w:val="22"/>
-          <w:szCs w:val="22"/>
-        </w:rPr>
-        <w:tab/>
-      </w:r>
-      <w:r>
-        <w:rPr>
-          <w:sz w:val="22"/>
-          <w:szCs w:val="22"/>
-        </w:rPr>
-        <w:tab/>
-      </w:r>
-      <w:r>
-        <w:rPr>
-          <w:sz w:val="16"/>
-          <w:szCs w:val="16"/>
-        </w:rPr>
-        <w:t xml:space="preserve">Rev </w:t>
-      </w:r>
-      <w:r>
-        <w:rPr>
-          <w:sz w:val="16"/>
-          <w:szCs w:val="16"/>
-        </w:rPr>
-        <w:t>2</w:t>
-      </w:r>
-      <w:r>
-        <w:rPr>
-          <w:sz w:val="16"/>
-          <w:szCs w:val="16"/>
-        </w:rPr>
-        <w:t>:</w:t>
-      </w:r>
-      <w:r>
-        <w:rPr>
-          <w:sz w:val="16"/>
-          <w:szCs w:val="16"/>
-        </w:rPr>
-        <w:t xml:space="preserve"> 01/04/2024</w:t>
-      </w:r>
-    </w:p>
-    <w:p>
-      <w:pPr>
-        <w:rPr>
-          <w:sz w:val="16"/>
-          <w:szCs w:val="16"/>
-        </w:rPr>
-      </w:pPr>
-    </w:p>
-    <w:p>
-      <w:pPr>
         <w:rPr>
           <w:sz w:val="22"/>
           <w:szCs w:val="22"/>
@@ -2031,6 +1781,8 @@
       </w:pPr>
     </w:p>
     <w:sectPr>
+      <w:headerReference w:type="default" r:id="rId8"/>
+      <w:footerReference w:type="default" r:id="rId9"/>
       <w:pgSz w:w="12240" w:h="15840"/>
       <w:pgMar w:top="576" w:right="576" w:bottom="576" w:left="576" w:header="720" w:footer="720" w:gutter="0"/>
       <w:cols w:space="720"/>
@@ -2038,6 +1790,26 @@
     </w:sectPr>
   </w:body>
 </w:document>
+</file>
+
+<file path=word/footer1.xml><?xml version="1.0" encoding="utf-8"?>
+<w:ftr xmlns:m="http://schemas.openxmlformats.org/officeDocument/2006/math" xmlns:mc="http://schemas.openxmlformats.org/markup-compatibility/2006" xmlns:mo="http://schemas.microsoft.com/office/mac/office/2008/main" xmlns:mv="urn:schemas-microsoft-com:mac:vml" xmlns:o="urn:schemas-microsoft-com:office:office" xmlns:r="http://schemas.openxmlformats.org/officeDocument/2006/relationships" xmlns:v="urn:schemas-microsoft-com:vml" xmlns:w10="urn:schemas-microsoft-com:office:word" xmlns:w14="http://schemas.microsoft.com/office/word/2010/wordml" xmlns:w="http://schemas.openxmlformats.org/wordprocessingml/2006/main" xmlns:wne="http://schemas.microsoft.com/office/word/2006/wordml" xmlns:wp14="http://schemas.microsoft.com/office/word/2010/wordprocessingDrawing" xmlns:wp="http://schemas.openxmlformats.org/drawingml/2006/wordprocessingDrawing" xmlns:wpc="http://schemas.microsoft.com/office/word/2010/wordprocessingCanvas" xmlns:wpg="http://schemas.microsoft.com/office/word/2010/wordprocessingGroup" xmlns:wpi="http://schemas.microsoft.com/office/word/2010/wordprocessingInk" xmlns:wps="http://schemas.microsoft.com/office/word/2010/wordprocessingShape" mc:Ignorable="w14 wp14">
+  <w:p>
+    <w:pPr>
+      <w:pStyle w:val="Footer"/>
+    </w:pPr>
+  </w:p>
+</w:ftr>
+</file>
+
+<file path=word/header1.xml><?xml version="1.0" encoding="utf-8"?>
+<w:hdr xmlns:m="http://schemas.openxmlformats.org/officeDocument/2006/math" xmlns:mc="http://schemas.openxmlformats.org/markup-compatibility/2006" xmlns:mo="http://schemas.microsoft.com/office/mac/office/2008/main" xmlns:mv="urn:schemas-microsoft-com:mac:vml" xmlns:o="urn:schemas-microsoft-com:office:office" xmlns:r="http://schemas.openxmlformats.org/officeDocument/2006/relationships" xmlns:v="urn:schemas-microsoft-com:vml" xmlns:w10="urn:schemas-microsoft-com:office:word" xmlns:w14="http://schemas.microsoft.com/office/word/2010/wordml" xmlns:w="http://schemas.openxmlformats.org/wordprocessingml/2006/main" xmlns:wne="http://schemas.microsoft.com/office/word/2006/wordml" xmlns:wp14="http://schemas.microsoft.com/office/word/2010/wordprocessingDrawing" xmlns:wp="http://schemas.openxmlformats.org/drawingml/2006/wordprocessingDrawing" xmlns:wpc="http://schemas.microsoft.com/office/word/2010/wordprocessingCanvas" xmlns:wpg="http://schemas.microsoft.com/office/word/2010/wordprocessingGroup" xmlns:wpi="http://schemas.microsoft.com/office/word/2010/wordprocessingInk" xmlns:wps="http://schemas.microsoft.com/office/word/2010/wordprocessingShape" mc:Ignorable="w14 wp14">
+  <w:p>
+    <w:pPr>
+      <w:pStyle w:val="Header"/>
+    </w:pPr>
+  </w:p>
+</w:hdr>
 </file>
 
 <file path=word/numbering.xml><?xml version="1.0" encoding="utf-8"?>

</xml_diff>